<commit_message>
Report: reference 11 replaced with Gong et al. 2022 (Friction), text and bib updated
</commit_message>
<xml_diff>
--- a/docs/final_report/TinySHM_Report.docx
+++ b/docs/final_report/TinySHM_Report.docx
@@ -443,7 +443,7 @@
         <w:jc w:val="both"/>
       </w:pPr>
       <w:r>
-        <w:t xml:space="preserve">Loose supports and loose bolted joints are among the most frequent problems in real structures. Many studies have been carried out on detecting looseness in threaded fasteners [11]. Vibration-based techniques monitor the change in stiffness and the energy lost at the contact interface, which show up as changes in frequency and damping [11]. This is why damping has been selected as a feature.</w:t>
+        <w:t>Loose supports and loose bolted joints are among the most frequent problems in real structures. Gong et al. review the research on loosening of threaded fasteners and show that it is driven by slippage and friction at the thread and bearing contact surfaces [11]. A loosening joint therefore loses clamping stiffness and dissipates energy through friction at the contact interface, which shows up as changes in frequency and damping. This is why damping has been selected as a feature.</w:t>
       </w:r>
     </w:p>
     <w:p>
@@ -8456,20 +8456,20 @@
           <w:sz w:val="16"/>
         </w:rPr>
         <w:tab/>
-        <w:t xml:space="preserve">J. Huang, J. Liu, H. Gong and X. Deng, “A comprehensive review of loosening detection methods for threaded fasteners,” </w:t>
+        <w:t xml:space="preserve">H. Gong, X. Ding, J. Liu and H. Feng, “Review of research on loosening of threaded fasteners,” </w:t>
       </w:r>
       <w:r>
         <w:rPr>
           <w:i/>
           <w:sz w:val="16"/>
         </w:rPr>
-        <w:t>Mechanical Systems and Signal Processing</w:t>
+        <w:t>Friction</w:t>
       </w:r>
       <w:r>
         <w:rPr>
           <w:sz w:val="16"/>
         </w:rPr>
-        <w:t>, vol. 168, Art. no. 108652, 2022, doi: 10.1016/j.ymssp.2021.108652.</w:t>
+        <w:t>, vol. 10, no. 3, pp. 335–359, 2022, doi: 10.1007/s40544-021-0497-1.</w:t>
       </w:r>
     </w:p>
     <w:p>

</xml_diff>

<commit_message>
Report: both days (131 flicks), calibration-relative 2-feature model, 5-feature test, dashboard figure
</commit_message>
<xml_diff>
--- a/docs/final_report/TinySHM_Report.docx
+++ b/docs/final_report/TinySHM_Report.docx
@@ -192,17 +192,7 @@
           <w:i/>
           <w:sz w:val="18"/>
         </w:rPr>
-        <w:t>Abstract—</w:t>
-      </w:r>
-      <w:r>
-        <w:t xml:space="preserve"> </w:t>
-      </w:r>
-      <w:r>
-        <w:rPr>
-          <w:b/>
-          <w:sz w:val="18"/>
-        </w:rPr>
-        <w:t xml:space="preserve">Structural health monitoring (SHM) can detect damage at an early stage. However, most vibration-based SHM systems require expensive data acquisition hardware and computer analysis. The most common damage indicator, natural frequency, is not always effective at detecting faults and will change due to benign factors such as extra mass. Most recent work on TinyML has focused on powerful processing units and there is a lack of fully verified systems using a simple microcontroller. A damage detection system is presented which runs entirely on the LPC1768 ARM Cortex-M3. The MPU6050 MEMS accelerometer samples free vibration of a steel cantilever at 100 Hz. A windowed 1024-point FFT is performed, using parabolic interpolation to obtain peak values, and log envelope damping estimation in the firmware. A decision tree, k-nearest neighbours, 5-8-4 neural network, health score and change detection algorithm are run. All algorithms were trained offline and converted into C code. The neural network achieved 93.8% accuracy (84.2% using a frequency rule) using 89 lab samples. These samples included a healthy state, extra mass, loose joints and loosened supports. The health score had an average error of 5.6 points, and the board and PC agreed on all 89 samples. Damping was used to detect loosened supports rather than frequency. Explainable SHM can be implemented in 20 KB of flash memory on an entry-level microcontroller.</w:t>
+        <w:t>Abstract— Structural health monitoring (SHM) can detect damage at an early stage. However, most vibration-based SHM systems require expensive data acquisition hardware and computer analysis. The most common damage indicator, natural frequency, is not always effective at detecting faults and will change due to benign factors such as extra mass. Most recent work on TinyML has focused on powerful processing units and there is a lack of fully verified systems using a simple microcontroller. A damage detection system is presented which runs entirely on the LPC1768 ARM Cortex-M3. The MPU6050 MEMS accelerometer samples free vibration of a steel cantilever at 100 Hz. A windowed 1024-point FFT with parabolic interpolation gives the natural frequency, and a log envelope fit gives damping. Both are taken relative to a baseline set on the board from ten healthy flicks, so the system adapts to a new board or setup without retraining. A decision tree, k-nearest neighbours, a 2-8-4 neural network, a health score and a change detector run on the board; all were trained offline and converted into C code. On 131 lab recordings over two days and two boards, covering a healthy state, extra mass, loose joints and loosened supports, kNN reached 96.0% accuracy and the neural network 93.1%, against 78.0% for a frequency-only rule. The health score had an average error of 4.3 points. A live browser dashboard shows the results of every flick. Explainable SHM can be implemented in about 20 KB of flash memory on an entry-level microcontroller.</w:t>
       </w:r>
     </w:p>
     <w:p>
@@ -361,10 +351,8 @@
       </w:pPr>
       <w:r>
         <w:t>4)</w:t>
-      </w:r>
-      <w:r>
         <w:tab/>
-        <w:t>An experimental study on 89 recordings showing that the ML outperforms a frequency-only rule, that damping is the only usable indicator of support loosening, and that board and PC outputs are identical.</w:t>
+        <w:t>An experimental study on 131 recordings over two days and two boards showing that calibration-relative features keep the models accurate across boards, that the ML outperforms a frequency-only rule, and that board and PC outputs are identical.</w:t>
       </w:r>
     </w:p>
     <w:p>
@@ -1202,7 +1190,7 @@
               <w:rPr>
                 <w:sz w:val="16"/>
               </w:rPr>
-              <w:t>freq., damping,</w:t>
+              <w:t>freq., damping</w:t>
             </w:r>
           </w:p>
         </w:tc>
@@ -1295,7 +1283,7 @@
               <w:rPr>
                 <w:sz w:val="16"/>
               </w:rPr>
-              <w:t>3 more</w:t>
+              <w:t>(relative)</w:t>
             </w:r>
           </w:p>
         </w:tc>
@@ -1314,7 +1302,7 @@
               <w:rPr>
                 <w:sz w:val="16"/>
               </w:rPr>
-              <w:t>(89 flicks)</w:t>
+              <w:t>(131 flicks)</w:t>
             </w:r>
           </w:p>
         </w:tc>
@@ -1365,7 +1353,7 @@
         </w:sectPr>
       </w:pPr>
       <w:r>
-        <w:t xml:space="preserve">The methodology used is shown in Fig. 1. Each labelled flick is stored on the board and then transferred to the laptop via UART. The laptop then uses the same 5 features as the board to train and cross-validate the models. Once trained, they are exported into a C header file (model.h) which is then compiled into the firmware. All new flicks are then classified using only the board. Finally, a parity check runs the same C code on the PC over every recording and compares its output with Python.</w:t>
+        <w:t>The methodology used is shown in Fig. 1. Each labelled flick is stored on the board and then transferred to the laptop via UART. The laptop extracts the same features as the board, expresses them relative to the healthy baseline of that session, and trains and cross-validates the models. Once trained, they are exported into a C header file (model.h) which is then compiled into the firmware. In use, the board first records ten healthy flicks (key C) to set its own baseline, and all new flicks are then classified on the board. Finally, a parity check runs the same C code on the PC over every recording and compares its output with Python.</w:t>
       </w:r>
     </w:p>
     <w:p>
@@ -3913,7 +3901,7 @@
         <w:jc w:val="both"/>
       </w:pPr>
       <w:r>
-        <w:t xml:space="preserve">All models use the standardised features </w:t>
+        <w:t xml:space="preserve">All models use two calibration-relative features: the ratio of f1 to the baseline f1 and the change in damping from the baseline damping, both standardised, </w:t>
       </w:r>
       <m:oMath>
         <m:sSub>
@@ -4279,7 +4267,7 @@
         </m:r>
       </m:oMath>
       <w:r>
-        <w:t xml:space="preserve"> with Euclidean distance over the 68 stored training flicks; new examples can be added on the board in teach mode.</w:t>
+        <w:t xml:space="preserve"> with Euclidean distance over the 101 stored training flicks; new examples can be added on the board in teach mode.</w:t>
       </w:r>
     </w:p>
     <w:p>
@@ -4292,10 +4280,7 @@
         <w:rPr>
           <w:i/>
         </w:rPr>
-        <w:t>Neural network</w:t>
-      </w:r>
-      <w:r>
-        <w:t>: a 5-8-4 multilayer perceptron,</w:t>
+        <w:t>Neural network: a 2-8-4 multilayer perceptron,</w:t>
       </w:r>
     </w:p>
     <w:p>
@@ -4574,7 +4559,7 @@
         <w:jc w:val="both"/>
       </w:pPr>
       <w:r>
-        <w:t xml:space="preserve">with 84 parameters; the largest </w:t>
+        <w:t xml:space="preserve">with 60 parameters; the largest </w:t>
       </w:r>
       <m:oMath>
         <m:sSub>
@@ -4674,7 +4659,7 @@
         </m:d>
       </m:oMath>
       <w:r>
-        <w:t xml:space="preserve"> (healthy 0, added mass 0, loose joint 0.5 and 1.0, loose support up to 0.75). The health of a new</w:t>
+        <w:t xml:space="preserve"> (healthy 0, added mass 0.15, loose joint 0.5 and 1.0, loose support up to 0.75). The health of a new</w:t>
       </w:r>
       <w:r>
         <w:t>ly done</w:t>
@@ -5297,7 +5282,7 @@
         </m:sSup>
       </m:oMath>
       <w:r>
-        <w:t xml:space="preserve"> can be recalibrated on the board from ten healthy flicks (key C). </w:t>
+        <w:t xml:space="preserve"> is set on the board from ten healthy flicks (key C); the median of these flicks is used, so one bad flick does not move it. Key B lets the operator mark the support as loose (health capped at 50%) and key D clears the mark. </w:t>
       </w:r>
       <w:r>
         <w:rPr>
@@ -5529,10 +5514,7 @@
         <w:jc w:val="both"/>
       </w:pPr>
       <w:r>
-        <w:t>Each flick is</w:t>
-      </w:r>
-      <w:r>
-        <w:t xml:space="preserve"> labelled on the laptop and stored with the raw sample data. The data set can be seen in Table II. Prior to each fault, a check was performed on the beam configuration to ensure it was identical to that of a healthy device. Any flicks that resulted in an incorrect overlap of 15 cm between the two rulers were discarded (24 in total). The first two steps corresponding to the loosening of the supports were also excluded from the training data set as the feature values were within the healthy range (Section IV-C). However, they were included in the hold-out test data along with five healthy verification flicks. The accuracy is calculated by using 5-fold stratified cross-validation repeated 5 times on the 68 training flicks.</w:t>
+        <w:t>Each flick is labelled on the laptop and stored with the raw sample data. Data was recorded on two days (Table II): day 1 on the original board and day 2 on a different LPC1768 board, on which the same healthy beam read about 4.4 Hz instead of 4.74 Hz. The cause of this offset was not found, which motivated the switch to features relative to a healthy baseline taken at the start of each session. Prior to each fault, a check was performed on the beam configuration to ensure it was identical to that of a healthy device. Any flicks that resulted in an incorrect overlap of 15 cm between the two rulers were discarded (24 in total). The first two steps of support loosening were excluded from training as their features were within the healthy range (Section IV-C), and were used as a held-out test with five healthy verification flicks. The accuracy is calculated by using 5-fold stratified cross-validation repeated 5 times on the 101 training flicks.</w:t>
       </w:r>
     </w:p>
     <w:p>
@@ -5560,7 +5542,7 @@
           <w:smallCaps/>
           <w:sz w:val="16"/>
         </w:rPr>
-        <w:t>Recorded dataset (medians)</w:t>
+        <w:t>Recorded dataset, day 1 / day 2 (medians)</w:t>
       </w:r>
     </w:p>
     <w:tbl>
@@ -5620,7 +5602,7 @@
               <w:rPr>
                 <w:sz w:val="16"/>
               </w:rPr>
-              <w:t>Flicks</w:t>
+              <w:t>Flicks (day 1 / 2)</w:t>
             </w:r>
           </w:p>
         </w:tc>
@@ -5758,7 +5740,7 @@
               <w:rPr>
                 <w:sz w:val="16"/>
               </w:rPr>
-              <w:t>30</w:t>
+              <w:t>30 / 7</w:t>
             </w:r>
           </w:p>
         </w:tc>
@@ -5775,7 +5757,7 @@
               <w:rPr>
                 <w:sz w:val="16"/>
               </w:rPr>
-              <w:t>4.74</w:t>
+              <w:t>4.74 / 4.39</w:t>
             </w:r>
           </w:p>
         </w:tc>
@@ -5792,7 +5774,7 @@
               <w:rPr>
                 <w:sz w:val="16"/>
               </w:rPr>
-              <w:t>2.92</w:t>
+              <w:t>2.92 / 2.53</w:t>
             </w:r>
           </w:p>
         </w:tc>
@@ -5849,7 +5831,7 @@
               <w:rPr>
                 <w:sz w:val="16"/>
               </w:rPr>
-              <w:t>12</w:t>
+              <w:t>12 / 5</w:t>
             </w:r>
           </w:p>
         </w:tc>
@@ -5866,7 +5848,7 @@
               <w:rPr>
                 <w:sz w:val="16"/>
               </w:rPr>
-              <w:t>3.68</w:t>
+              <w:t>3.68 / 3.35</w:t>
             </w:r>
           </w:p>
         </w:tc>
@@ -5883,7 +5865,7 @@
               <w:rPr>
                 <w:sz w:val="16"/>
               </w:rPr>
-              <w:t>2.58</w:t>
+              <w:t>2.58 / 1.65</w:t>
             </w:r>
           </w:p>
         </w:tc>
@@ -5940,7 +5922,7 @@
               <w:rPr>
                 <w:sz w:val="16"/>
               </w:rPr>
-              <w:t>10</w:t>
+              <w:t>10 / 11</w:t>
             </w:r>
           </w:p>
         </w:tc>
@@ -5957,7 +5939,7 @@
               <w:rPr>
                 <w:sz w:val="16"/>
               </w:rPr>
-              <w:t>4.47</w:t>
+              <w:t>4.47 / 4.25</w:t>
             </w:r>
           </w:p>
         </w:tc>
@@ -5974,7 +5956,7 @@
               <w:rPr>
                 <w:sz w:val="16"/>
               </w:rPr>
-              <w:t>2.67</w:t>
+              <w:t>2.67 / 1.91</w:t>
             </w:r>
           </w:p>
         </w:tc>
@@ -6031,7 +6013,7 @@
               <w:rPr>
                 <w:sz w:val="16"/>
               </w:rPr>
-              <w:t>8</w:t>
+              <w:t>8 / 5</w:t>
             </w:r>
           </w:p>
         </w:tc>
@@ -6048,7 +6030,7 @@
               <w:rPr>
                 <w:sz w:val="16"/>
               </w:rPr>
-              <w:t>4.45</w:t>
+              <w:t>4.45 / 4.02</w:t>
             </w:r>
           </w:p>
         </w:tc>
@@ -6065,7 +6047,7 @@
               <w:rPr>
                 <w:sz w:val="16"/>
               </w:rPr>
-              <w:t>1.16</w:t>
+              <w:t>1.16 / 1.00</w:t>
             </w:r>
           </w:p>
         </w:tc>
@@ -6122,7 +6104,7 @@
               <w:rPr>
                 <w:sz w:val="16"/>
               </w:rPr>
-              <w:t>8</w:t>
+              <w:t>8 / 5</w:t>
             </w:r>
           </w:p>
         </w:tc>
@@ -6139,7 +6121,7 @@
               <w:rPr>
                 <w:sz w:val="16"/>
               </w:rPr>
-              <w:t>4.75</w:t>
+              <w:t>4.75 / 4.71</w:t>
             </w:r>
           </w:p>
         </w:tc>
@@ -6156,7 +6138,7 @@
               <w:rPr>
                 <w:sz w:val="16"/>
               </w:rPr>
-              <w:t>3.45</w:t>
+              <w:t>3.45 / 3.11</w:t>
             </w:r>
           </w:p>
         </w:tc>
@@ -6213,7 +6195,7 @@
               <w:rPr>
                 <w:sz w:val="16"/>
               </w:rPr>
-              <w:t>8</w:t>
+              <w:t>8 / 5</w:t>
             </w:r>
           </w:p>
         </w:tc>
@@ -6230,7 +6212,7 @@
               <w:rPr>
                 <w:sz w:val="16"/>
               </w:rPr>
-              <w:t>4.71</w:t>
+              <w:t>4.71 / 4.43</w:t>
             </w:r>
           </w:p>
         </w:tc>
@@ -6247,7 +6229,7 @@
               <w:rPr>
                 <w:sz w:val="16"/>
               </w:rPr>
-              <w:t>3.26</w:t>
+              <w:t>3.26 / 3.14</w:t>
             </w:r>
           </w:p>
         </w:tc>
@@ -6304,7 +6286,7 @@
               <w:rPr>
                 <w:sz w:val="16"/>
               </w:rPr>
-              <w:t>8</w:t>
+              <w:t>8 / 4</w:t>
             </w:r>
           </w:p>
         </w:tc>
@@ -6321,7 +6303,7 @@
               <w:rPr>
                 <w:sz w:val="16"/>
               </w:rPr>
-              <w:t>4.75</w:t>
+              <w:t>4.75 / 4.46</w:t>
             </w:r>
           </w:p>
         </w:tc>
@@ -6338,7 +6320,7 @@
               <w:rPr>
                 <w:sz w:val="16"/>
               </w:rPr>
-              <w:t>3.13</w:t>
+              <w:t>3.13 / 2.78</w:t>
             </w:r>
           </w:p>
         </w:tc>
@@ -6395,7 +6377,7 @@
               <w:rPr>
                 <w:sz w:val="16"/>
               </w:rPr>
-              <w:t>5</w:t>
+              <w:t>5 / 0</w:t>
             </w:r>
           </w:p>
         </w:tc>
@@ -6412,7 +6394,7 @@
               <w:rPr>
                 <w:sz w:val="16"/>
               </w:rPr>
-              <w:t>4.68</w:t>
+              <w:t>4.68 / -</w:t>
             </w:r>
           </w:p>
         </w:tc>
@@ -6429,7 +6411,7 @@
               <w:rPr>
                 <w:sz w:val="16"/>
               </w:rPr>
-              <w:t>2.95</w:t>
+              <w:t>2.95 / -</w:t>
             </w:r>
           </w:p>
         </w:tc>
@@ -6490,7 +6472,7 @@
               <w:rPr>
                 <w:sz w:val="16"/>
               </w:rPr>
-              <w:t>89</w:t>
+              <w:t>89 / 42 = 131</w:t>
             </w:r>
           </w:p>
         </w:tc>
@@ -6505,6 +6487,7 @@
             <w:pPr>
               <w:spacing w:after="0"/>
             </w:pPr>
+            <w:r/>
           </w:p>
         </w:tc>
         <w:tc>
@@ -6518,6 +6501,7 @@
             <w:pPr>
               <w:spacing w:after="0"/>
             </w:pPr>
+            <w:r/>
           </w:p>
         </w:tc>
         <w:tc>
@@ -6531,6 +6515,7 @@
             <w:pPr>
               <w:spacing w:after="0"/>
             </w:pPr>
+            <w:r/>
           </w:p>
         </w:tc>
       </w:tr>
@@ -6587,7 +6572,7 @@
         </m:r>
       </m:oMath>
       <w:r>
-        <w:t xml:space="preserve"> zero-padded FFT reference over all 89 flicks, with execution times measured on the LPC1768 using SysTick. Parabolic interpolation reduced the mean error from 0.027 Hz to 0.009 Hz, less than a tenth of the bin width, at no measurable extra time. Zero-crossing counting is 28 times faster but its mean error of 0.34 Hz is larger than the 0.27 Hz shift caused by a loose joint, so it cannot separate the classes (Fig. 7). The FFT takes 117 ms, which is negligible against the 10.24 s recording.</w:t>
+        <w:t xml:space="preserve"> zero-padded FFT reference over the 89 day-1 flicks, with execution times measured on the LPC1768 using SysTick. Parabolic interpolation reduced the mean error from 0.027 Hz to 0.009 Hz, less than a tenth of the bin width, at no measurable extra time. Zero-crossing counting is 28 times faster but its mean error of 0.34 Hz is larger than the 0.27 Hz shift caused by a loose joint, so it cannot separate the classes (Fig. 7). The FFT takes 117 ms, which is negligible against the 10.24 s recording.</w:t>
       </w:r>
     </w:p>
     <w:p>
@@ -7289,55 +7274,7 @@
         <w:jc w:val="both"/>
       </w:pPr>
       <w:r>
-        <w:t xml:space="preserve">Fig. 8 shows the damping and frequency of each flick. The added mass reduced </w:t>
-      </w:r>
-      <w:r>
-        <w:rPr>
-          <w:i/>
-        </w:rPr>
-        <w:t xml:space="preserve">f</w:t>
-      </w:r>
-      <w:r>
-        <w:rPr>
-          <w:vertAlign w:val="subscript"/>
-        </w:rPr>
-        <w:t xml:space="preserve">1</w:t>
-      </w:r>
-      <w:r>
-        <w:rPr/>
-        <w:t xml:space="preserve"> by 22%, as predicted by (1). Removing clips decreased </w:t>
-      </w:r>
-      <w:r>
-        <w:rPr>
-          <w:i/>
-        </w:rPr>
-        <w:t xml:space="preserve">f</w:t>
-      </w:r>
-      <w:r>
-        <w:rPr>
-          <w:vertAlign w:val="subscript"/>
-        </w:rPr>
-        <w:t xml:space="preserve">1</w:t>
-      </w:r>
-      <w:r>
-        <w:rPr/>
-        <w:t xml:space="preserve"> by around 6% due to a loss of stiffness in the joint. Removing the second clip also decreased damping from 2.9% to 1.2%, because less friction remains at the overlap. When the support is loosened there is no change in </w:t>
-      </w:r>
-      <w:r>
-        <w:rPr>
-          <w:i/>
-        </w:rPr>
-        <w:t xml:space="preserve">f</w:t>
-      </w:r>
-      <w:r>
-        <w:rPr>
-          <w:vertAlign w:val="subscript"/>
-        </w:rPr>
-        <w:t xml:space="preserve">1</w:t>
-      </w:r>
-      <w:r>
-        <w:rPr/>
-        <w:t xml:space="preserve"> (4.75 Hz against 4.74 Hz), but damping increases because the loose end loses energy through friction. This matches the loosening literature [11]. This fault cannot be seen using frequency alone.</w:t>
+        <w:t>Fig. 8 shows the relative damping and frequency of each flick. The added mass reduced f1 by about 22% on both days, as predicted by (1). Removing clips decreased f1 by around 5% to 8% due to a loss of stiffness in the joint. Removing the second clip also decreased damping from about 2.5% to 1.0%, because less friction remains at the overlap. When the support is loosened f1 hardly changes, but damping increases because the loose end loses energy through friction. This matches the loosening literature [11]. This fault cannot be seen using frequency alone. Although the absolute frequencies differ by about 0.35 Hz between the two boards, the relative changes for each fault are the same, so one model serves both.</w:t>
       </w:r>
     </w:p>
     <w:p>
@@ -7359,7 +7296,7 @@
         <w:jc w:val="both"/>
       </w:pPr>
       <w:r>
-        <w:t xml:space="preserve">Fig. 9 shows damping at each loosening step. At 1/4 and 1/2 turn the damping stays within the healthy range. For 3/4 turn every flick exceeds the maximum value found in the normal range by a median of +18%. The screw clamp also maintained a tight grip on the ruler until it was almost released, so the first two steps were below the detection threshold of this system. On these held-out flicks, the neural network labelled 4 of 8 and 3 of 8 as loose support. The change detector triggered once. This is consistent with the features being on the edge of the cluster of normal data.</w:t>
+        <w:t>Fig. 9 shows damping at each loosening step. At 1/4 and 1/2 turn the damping stays close to the healthy range, and only at 3/4 turn is it clearly higher. The screw clamp maintained a tight grip on the ruler until it was almost released, so the first two steps were near or below the detection threshold of this system. On these held-out flicks, the neural network labelled 7 of 13 (1/4 turn) and 0 of 12 (1/2 turn) as loose support, consistent with the features lying on the edge of the normal cluster. For this reason the firmware also offers key B, so an operator who sees a loose clamp can mark it directly.</w:t>
       </w:r>
     </w:p>
     <w:p>
@@ -7381,7 +7318,7 @@
         <w:jc w:val="both"/>
       </w:pPr>
       <w:r>
-        <w:t xml:space="preserve">Table IV and Fig. 10 give the cross-validated accuracy. All three ML models beat the frequency-only rule by 8 to 10 percentage points. The decision tree uses </w:t>
+        <w:t xml:space="preserve">Table IV and Fig. 10 give the cross-validated accuracy. All three ML models beat the frequency-only rule (78.0%), by 10 to 18 percentage points, and kNN is best at 96.0%. The decision tree uses </w:t>
       </w:r>
       <m:oMath>
         <m:sSub>
@@ -7411,11 +7348,10 @@
         </m:sSub>
       </m:oMath>
       <w:r>
-        <w:t xml:space="preserve"> for 71% of its splits and damping for 27%, confirming that the gain comes from the damping feature. The confusion matrices in Fig. 11 </w:t>
-      </w:r>
-      <w:r>
-        <w:lastRenderedPageBreak/>
-        <w:t>show that most remaining errors are between healthy and loose support, the hardest pair. All five healthy re-check flicks were classified as healthy with no CHANGED alarm.</w:t>
+        <w:t xml:space="preserve"> for 43% of its splits and damping for 57%, confirming that the gain comes from the damping feature. The confusion matrices in Fig. 11 </w:t>
+      </w:r>
+      <w:r>
+        <w:t>show that most remaining errors are between healthy and loose support, the hardest pair. All five healthy re-check flicks were classified as healthy with no CHANGED alarm. Using all five features (adding amplitude, energy ratio and decay time) was also tested: accuracy fell to 85.7% (kNN), 87.3% (neural network) and 88.6% (tree), and the health error rose to 10.1 points, because these extra features vary with the strength of the hand flick and between boards. The final model therefore uses only the two relative features.</w:t>
       </w:r>
     </w:p>
     <w:p>
@@ -7573,7 +7509,7 @@
               <w:rPr>
                 <w:sz w:val="16"/>
               </w:rPr>
-              <w:t>84.2%</w:t>
+              <w:t>78.0%</w:t>
             </w:r>
           </w:p>
         </w:tc>
@@ -7613,7 +7549,7 @@
               <w:rPr>
                 <w:sz w:val="16"/>
               </w:rPr>
-              <w:t>92.4%</w:t>
+              <w:t>87.9%</w:t>
             </w:r>
           </w:p>
         </w:tc>
@@ -7676,7 +7612,7 @@
               <w:rPr>
                 <w:sz w:val="16"/>
               </w:rPr>
-              <w:t>92.1%</w:t>
+              <w:t>96.0%</w:t>
             </w:r>
           </w:p>
         </w:tc>
@@ -7701,7 +7637,7 @@
               <w:rPr>
                 <w:sz w:val="16"/>
               </w:rPr>
-              <w:t>Neural network 5-8-4</w:t>
+              <w:t>Neural network 2-8-4</w:t>
             </w:r>
           </w:p>
         </w:tc>
@@ -7721,7 +7657,7 @@
                 <w:b/>
                 <w:sz w:val="16"/>
               </w:rPr>
-              <w:t>93.8%</w:t>
+              <w:t>93.1%</w:t>
             </w:r>
           </w:p>
         </w:tc>
@@ -7811,7 +7747,7 @@
         <w:jc w:val="both"/>
       </w:pPr>
       <w:r>
-        <w:t>The kNN health score had a mean absolute error of 5.6 points, against 17.8 points for linear regression on the same features (Fig. 12). In leave-one-out tests, healthy flicks scored 95.8 on average and none fell below the unsafe threshold. Over the support-loosening steps the mean health was 97, 66, 69 and 33. A line fitted to steps 0 to 2 predicted the beam would become unsafe at step 3.6; in the experiment it was unsafe at step 3, so the forecast was slightly late but in the right range (Fig. 12, right).</w:t>
+        <w:t>The kNN health score had a mean absolute error of 4.3 points, against 29.1 points for linear regression on the same features (Fig. 12). With the added-mass damage level set to 0.15, a coin reads about 85% rather than being treated as damage, while the loose joint reads about 50% at level 1 and close to 0% at level 2, which is reported as UNSAFE. On the day-1 support-loosening steps, a line fitted to steps 0 to 2 predicted the beam would become unsafe at step 3.6; in the experiment it was unsafe at step 3, so the forecast was slightly late but in the right range (Fig. 12, right).</w:t>
       </w:r>
     </w:p>
     <w:tbl>
@@ -7964,7 +7900,7 @@
         <w:jc w:val="both"/>
       </w:pPr>
       <w:r>
-        <w:t xml:space="preserve">The full firmware, including the FFT, all models, and training data for the kNN algorithm requires approximately 20 KB of flash memory to store. This is well within the 32 KB limitation of the free Keil toolchain. The FFT buffers also require 8 KB of RAM. The C code was run through all 89 flicks on the PC and produced the same features and classifications as the Python reference implementation. Fig. 5 shows the board detecting a change and an unsafe health value during a fault test.</w:t>
+        <w:t>The full firmware, including the FFT, all models, and training data for the kNN algorithm requires approximately 20 KB of flash memory to store. This is well within the 32 KB limitation of the free Keil toolchain. The FFT buffers also require 8 KB of RAM. The C code was run through all flicks on the PC and produced the same features and classifications as the Python reference implementation. Fig. 5 shows the board detecting a change and an unsafe health value during a fault test. For each flick the board also sends its result and raw samples over UART to a laptop, where a browser dashboard (Fig. 13) shows the health gauge, the class chosen by each model, the waveform with its decay envelope, the spectrum, the calibration values and a health timeline. It runs offline and needs no internet.</w:t>
       </w:r>
     </w:p>
     <w:p>
@@ -7975,6 +7911,56 @@
       </w:pPr>
       <w:r>
         <w:t xml:space="preserve">Finally, the laptop transmits the results for each condition (median frequency, damping, health status, predicted class, confidence, cross-validated accuracies and trend prediction) to a large language model (gpt-oss-120b using the Groq API and using Gemini as a fallback). The language model is then prompted to produce a brief inspection summary in simple English. The language model does not make any decisions; all numbers come directly from the measured table, and all detection and classification is performed by the models on the board. In our case, the report correctly identified loose joint 2 and the 3/4 turn support as being unsafe, and identified the added mass as being harmless. However, the confidence of the classifier was exaggerated for the first two steps of loosening. Therefore, the report should always be checked against the table.</w:t>
+      </w:r>
+    </w:p>
+    <w:p>
+      <w:pPr>
+        <w:jc w:val="center"/>
+      </w:pPr>
+      <w:r>
+        <w:drawing>
+          <wp:inline xmlns:a="http://schemas.openxmlformats.org/drawingml/2006/main" xmlns:pic="http://schemas.openxmlformats.org/drawingml/2006/picture">
+            <wp:extent cx="3017520" cy="1526102"/>
+            <wp:docPr id="16" name="Picture 16"/>
+            <wp:cNvGraphicFramePr>
+              <a:graphicFrameLocks noChangeAspect="1"/>
+            </wp:cNvGraphicFramePr>
+            <a:graphic>
+              <a:graphicData uri="http://schemas.openxmlformats.org/drawingml/2006/picture">
+                <pic:pic>
+                  <pic:nvPicPr>
+                    <pic:cNvPr id="0" name="dashboard.png"/>
+                    <pic:cNvPicPr/>
+                  </pic:nvPicPr>
+                  <pic:blipFill>
+                    <a:blip r:embed="rId8"/>
+                    <a:stretch>
+                      <a:fillRect/>
+                    </a:stretch>
+                  </pic:blipFill>
+                  <pic:spPr>
+                    <a:xfrm>
+                      <a:off x="0" y="0"/>
+                      <a:ext cx="3017520" cy="1526102"/>
+                    </a:xfrm>
+                    <a:prstGeom prst="rect"/>
+                  </pic:spPr>
+                </pic:pic>
+              </a:graphicData>
+            </a:graphic>
+          </wp:inline>
+        </w:drawing>
+      </w:r>
+    </w:p>
+    <w:p>
+      <w:pPr>
+        <w:jc w:val="both"/>
+      </w:pPr>
+      <w:r>
+        <w:rPr>
+          <w:sz w:val="16"/>
+        </w:rPr>
+        <w:t>Fig. 13. Live browser dashboard during a loose-joint test: health gauge, model votes, modal features, waveform, spectrum, health timeline and calibration values.</w:t>
       </w:r>
     </w:p>
     <w:p>
@@ -7996,7 +7982,7 @@
         <w:jc w:val="both"/>
       </w:pPr>
       <w:r>
-        <w:t xml:space="preserve">Each contribution is backed by a measured result. The assemble-only bench allowed repeatable results when checking the healthy flick. The frequency was found to have a difference of 0.06 Hz between the healthy check after all faults had been fixed (4.68 Hz) and the original frequency (4.74 Hz). All 5 healthy checks were found to be healthy. Using the interpolated FFT algorithm on the Cortex-M3 to calculate frequency gave an average error of 0.009 Hz against the reference frequency. This is less than a tenth of the 0.098 Hz bin width and three times better than taking the peak bin alone (0.027 Hz). This was achieved in 117 ms. Adding damping and 3 additional features to the model improved the accuracy of 4 classes from 84.2% (classical frequency method) to 93.8% (neural network). Damping alone showed that when support loosening occurred it did not affect the frequency but did increase damping by 18%. The kNN model gave a good prediction of the severity of damage with an average error of 5.6 points. All healthy flicks had a score above the unsafe level. The trend prediction shows that the unsafe point would occur within one step of the actual unsafe point. Exporting the models to C kept the same features and logic as Python, giving identical results on all 89 flicks, and everything fits in about 20 KB of flash memory. An honest upper limit was found during this experiment. A support loosening of less than about 3/4 turn could not be differentiated from a healthy state using this sensor and structure.</w:t>
+        <w:t>Each contribution is backed by a measured result. The assemble-only bench allowed repeatable results: the day-1 healthy re-check after all faults read 4.68 Hz against the original 4.74 Hz, and all 5 healthy checks were found to be healthy. Using the interpolated FFT algorithm on the Cortex-M3 gave an average frequency error of 0.009 Hz, less than a tenth of the 0.098 Hz bin width and three times better than the peak bin alone (0.027 Hz), in 117 ms. Adding damping to frequency, both relative to an on-board baseline, improved 4-class accuracy from 78.0% (classical frequency method) to 96.0% (kNN) across two days and two boards. The kNN model predicted the severity of damage with an average error of 4.3 points. Exporting the models to C kept the same features and logic as Python, giving identical results, and everything fits in about 20 KB of flash memory. An honest upper limit was also found: a support loosening of less than about 3/4 turn could not be reliably told apart from a healthy state using this sensor and structure.</w:t>
       </w:r>
     </w:p>
     <w:p>
@@ -8018,7 +8004,7 @@
         <w:jc w:val="both"/>
       </w:pPr>
       <w:r>
-        <w:t>The dataset is small (89 flicks) and comes from one structure in one room, so temperature and long-term drift were not studied. Flicks were applied by hand, which varies the amplitude; the amplitude feature absorbs this, but a mechanical exciter would give cleaner data. Only the first mode was used.</w:t>
+        <w:t>The dataset is still small (131 flicks) and comes from one structure in one room, so temperature and long-term drift were not studied. The reason the second board read a lower frequency for the same beam was not found; calibration hides the offset but does not explain it. Flicks were applied by hand, which varies the amplitude; a mechanical exciter would give cleaner data. Only the first mode was used.</w:t>
       </w:r>
     </w:p>
     <w:p>
@@ -8041,7 +8027,7 @@
         <w:jc w:val="both"/>
       </w:pPr>
       <w:r>
-        <w:t xml:space="preserve">This paper demonstrates that a full damage detection system using vibration data, producing a fault name, health value and trend prediction from raw acceleration data can be implemented on an entry-level ARM Cortex-M3 processor and low-cost MEMS accelerometer. The tool-free cantilever test rig gave an accuracy of 93.8% in distinguishing between healthy, added mass, loose joint and loose support cases, compared to 84.2% using the classical frequency shift rule. The health value had an average error of 5.6 points. The main conclusion was that damping, which is not considered by the frequency rule, was the only usable source of information regarding loose supports. All models fit within approximately 20 KB of flash memory and behave identically to the PC version. In the future the system will be improved by implementing a mechanical exciter, temperature compensation, higher modes from a second sensor and more data (over multiple days) to reduce the detection limit for early loose support.</w:t>
+        <w:t>This paper demonstrates that a full damage detection system using vibration data, producing a fault name, health value and trend prediction from raw acceleration data, can be implemented on an entry-level ARM Cortex-M3 processor and a low-cost MEMS accelerometer. On 131 recordings over two days and two boards, the tool-free cantilever test rig gave an accuracy of 96.0% (kNN) in distinguishing between healthy, added mass, loose joint and loose support cases, compared to 78.0% using the classical frequency shift rule. The health value had an average error of 4.3 points. Calibrating on ten healthy flicks made the same model work on a board that read a different absolute frequency, and damping, which is not considered by the frequency rule, was the main source of information regarding loose supports. All models fit within approximately 20 KB of flash memory and behave identically to the PC version, and a live dashboard makes every result visible. In the future the system will be improved by implementing a mechanical exciter, temperature compensation, higher modes from a second sensor and more data to reduce the detection limit for early loose support.</w:t>
       </w:r>
     </w:p>
     <w:p>

</xml_diff>

<commit_message>
Retrain on 5 calibration-relative features (5-8-4 NN); report and author block updated
</commit_message>
<xml_diff>
--- a/docs/final_report/TinySHM_Report.docx
+++ b/docs/final_report/TinySHM_Report.docx
@@ -4,7 +4,7 @@
   <w:body>
     <w:p>
       <w:pPr>
-        <w:spacing w:after="280" w:line="240" w:lineRule="auto"/>
+        <w:spacing w:after="160" w:line="240" w:lineRule="auto"/>
         <w:jc w:val="center"/>
       </w:pPr>
       <w:r>
@@ -48,20 +48,50 @@
           </w:p>
           <w:p>
             <w:pPr>
-              <w:spacing w:after="0"/>
+              <w:spacing w:after="0" w:before="0"/>
               <w:jc w:val="center"/>
             </w:pPr>
             <w:r>
-              <w:t>Reg. No. 240953528</w:t>
+              <w:rPr>
+                <w:sz w:val="19"/>
+              </w:rPr>
+              <w:t>School of Computer Engineering</w:t>
             </w:r>
           </w:p>
           <w:p>
             <w:pPr>
-              <w:spacing w:after="0"/>
+              <w:spacing w:after="0" w:before="0"/>
               <w:jc w:val="center"/>
             </w:pPr>
             <w:r>
-              <w:t>Roll No. 42</w:t>
+              <w:rPr>
+                <w:sz w:val="19"/>
+              </w:rPr>
+              <w:t>Manipal Institute of Technology</w:t>
+            </w:r>
+          </w:p>
+          <w:p>
+            <w:pPr>
+              <w:spacing w:after="0" w:before="0"/>
+              <w:jc w:val="center"/>
+            </w:pPr>
+            <w:r>
+              <w:rPr>
+                <w:sz w:val="19"/>
+              </w:rPr>
+              <w:t>Manipal, India</w:t>
+            </w:r>
+          </w:p>
+          <w:p>
+            <w:pPr>
+              <w:spacing w:after="0" w:before="0"/>
+              <w:jc w:val="center"/>
+            </w:pPr>
+            <w:r>
+              <w:rPr>
+                <w:sz w:val="17"/>
+              </w:rPr>
+              <w:t>sagnik1.mitmpl2024@learner.manipal.edu</w:t>
             </w:r>
           </w:p>
         </w:tc>
@@ -83,20 +113,50 @@
           </w:p>
           <w:p>
             <w:pPr>
-              <w:spacing w:after="0"/>
+              <w:spacing w:after="0" w:before="0"/>
               <w:jc w:val="center"/>
             </w:pPr>
             <w:r>
-              <w:t>Reg. No. 240953548</w:t>
+              <w:rPr>
+                <w:sz w:val="19"/>
+              </w:rPr>
+              <w:t>School of Computer Engineering</w:t>
             </w:r>
           </w:p>
           <w:p>
             <w:pPr>
-              <w:spacing w:after="0"/>
+              <w:spacing w:after="0" w:before="0"/>
               <w:jc w:val="center"/>
             </w:pPr>
             <w:r>
-              <w:t>Roll No. 43</w:t>
+              <w:rPr>
+                <w:sz w:val="19"/>
+              </w:rPr>
+              <w:t>Manipal Institute of Technology</w:t>
+            </w:r>
+          </w:p>
+          <w:p>
+            <w:pPr>
+              <w:spacing w:after="0" w:before="0"/>
+              <w:jc w:val="center"/>
+            </w:pPr>
+            <w:r>
+              <w:rPr>
+                <w:sz w:val="19"/>
+              </w:rPr>
+              <w:t>Manipal, India</w:t>
+            </w:r>
+          </w:p>
+          <w:p>
+            <w:pPr>
+              <w:spacing w:after="0" w:before="0"/>
+              <w:jc w:val="center"/>
+            </w:pPr>
+            <w:r>
+              <w:rPr>
+                <w:sz w:val="17"/>
+              </w:rPr>
+              <w:t>pranav10.mitmpl2024@learner.manipal.edu</w:t>
             </w:r>
           </w:p>
         </w:tc>
@@ -118,20 +178,50 @@
           </w:p>
           <w:p>
             <w:pPr>
-              <w:spacing w:after="0"/>
+              <w:spacing w:after="0" w:before="0"/>
               <w:jc w:val="center"/>
             </w:pPr>
             <w:r>
-              <w:t>Reg. No. 240953556</w:t>
+              <w:rPr>
+                <w:sz w:val="19"/>
+              </w:rPr>
+              <w:t>School of Computer Engineering</w:t>
             </w:r>
           </w:p>
           <w:p>
             <w:pPr>
-              <w:spacing w:after="0"/>
+              <w:spacing w:after="0" w:before="0"/>
               <w:jc w:val="center"/>
             </w:pPr>
             <w:r>
-              <w:t>Roll No. 44</w:t>
+              <w:rPr>
+                <w:sz w:val="19"/>
+              </w:rPr>
+              <w:t>Manipal Institute of Technology</w:t>
+            </w:r>
+          </w:p>
+          <w:p>
+            <w:pPr>
+              <w:spacing w:after="0" w:before="0"/>
+              <w:jc w:val="center"/>
+            </w:pPr>
+            <w:r>
+              <w:rPr>
+                <w:sz w:val="19"/>
+              </w:rPr>
+              <w:t>Manipal, India</w:t>
+            </w:r>
+          </w:p>
+          <w:p>
+            <w:pPr>
+              <w:spacing w:after="0" w:before="0"/>
+              <w:jc w:val="center"/>
+            </w:pPr>
+            <w:r>
+              <w:rPr>
+                <w:sz w:val="17"/>
+              </w:rPr>
+              <w:t>shobit.mitmpl2024@learner.manipal.edu</w:t>
             </w:r>
           </w:p>
         </w:tc>
@@ -139,34 +229,7 @@
     </w:tbl>
     <w:p>
       <w:pPr>
-        <w:spacing w:before="200" w:after="0" w:line="240" w:lineRule="auto"/>
-        <w:jc w:val="center"/>
-      </w:pPr>
-      <w:r>
-        <w:t>School of Computer Engineering</w:t>
-      </w:r>
-    </w:p>
-    <w:p>
-      <w:pPr>
-        <w:spacing w:after="0" w:line="240" w:lineRule="auto"/>
-        <w:jc w:val="center"/>
-      </w:pPr>
-      <w:r>
-        <w:t>Section CCE A</w:t>
-      </w:r>
-    </w:p>
-    <w:p>
-      <w:pPr>
-        <w:spacing w:after="0" w:line="240" w:lineRule="auto"/>
-        <w:jc w:val="center"/>
-      </w:pPr>
-      <w:r>
-        <w:t>Manipal Institute of Technology, Manipal, India</w:t>
-      </w:r>
-    </w:p>
-    <w:p>
-      <w:pPr>
-        <w:spacing w:after="120" w:line="240" w:lineRule="auto"/>
+        <w:spacing w:after="80" w:line="240" w:lineRule="auto" w:before="0"/>
         <w:jc w:val="center"/>
       </w:pPr>
     </w:p>
@@ -192,7 +255,7 @@
           <w:i/>
           <w:sz w:val="18"/>
         </w:rPr>
-        <w:t>Abstract— Structural health monitoring (SHM) can detect damage at an early stage. However, most vibration-based SHM systems require expensive data acquisition hardware and computer analysis. The most common damage indicator, natural frequency, is not always effective at detecting faults and will change due to benign factors such as extra mass. Most recent work on TinyML has focused on powerful processing units and there is a lack of fully verified systems using a simple microcontroller. A damage detection system is presented which runs entirely on the LPC1768 ARM Cortex-M3. The MPU6050 MEMS accelerometer samples free vibration of a steel cantilever at 100 Hz. A windowed 1024-point FFT with parabolic interpolation gives the natural frequency, and a log envelope fit gives damping. Both are taken relative to a baseline set on the board from ten healthy flicks, so the system adapts to a new board or setup without retraining. A decision tree, k-nearest neighbours, a 2-8-4 neural network, a health score and a change detector run on the board; all were trained offline and converted into C code. On 131 lab recordings over two days and two boards, covering a healthy state, extra mass, loose joints and loosened supports, kNN reached 96.0% accuracy and the neural network 93.1%, against 78.0% for a frequency-only rule. The health score had an average error of 4.3 points. A live browser dashboard shows the results of every flick. Explainable SHM can be implemented in about 20 KB of flash memory on an entry-level microcontroller.</w:t>
+        <w:t>Abstract— Structural health monitoring (SHM) can detect damage at an early stage. However, most vibration-based SHM systems require expensive data acquisition hardware and computer analysis. The most common damage indicator, natural frequency, is not always effective at detecting faults and will change due to benign factors such as extra mass. Most recent work on TinyML has focused on powerful processing units and there is a lack of fully verified systems using a simple microcontroller. A damage detection system is presented which runs entirely on the LPC1768 ARM Cortex-M3. The MPU6050 MEMS accelerometer samples free vibration of a steel cantilever at 100 Hz. A windowed 1024-point FFT with parabolic interpolation gives the natural frequency, a log envelope fit gives damping, and three further features describe amplitude, rattle energy and decay time. All five are taken relative to a baseline set on the board from ten healthy flicks, so the system adapts to a new board or setup without retraining. A decision tree, k-nearest neighbours, a 5-8-4 neural network, a health score and a change detector run on the board; all were trained offline and converted into C code. On 131 lab recordings over two days and two boards, covering a healthy state, extra mass, loose joints and loosened supports, the decision tree reached 88.6% accuracy and the neural network 87.3%, against 78.0% for a frequency-only rule. The health score had an average error of 10.1 points. A live browser dashboard shows the results of every flick. Explainable SHM can be implemented in about 20 KB of flash memory on an entry-level microcontroller.</w:t>
       </w:r>
     </w:p>
     <w:p>
@@ -3901,7 +3964,7 @@
         <w:jc w:val="both"/>
       </w:pPr>
       <w:r>
-        <w:t xml:space="preserve">All models use two calibration-relative features: the ratio of f1 to the baseline f1 and the change in damping from the baseline damping, both standardised, </w:t>
+        <w:t xml:space="preserve">All models use five calibration-relative features: f1, amplitude and decay time as ratios to their baseline values, and damping and energy ratio as differences from their baseline values, all standardised, </w:t>
       </w:r>
       <m:oMath>
         <m:sSub>
@@ -4280,7 +4343,7 @@
         <w:rPr>
           <w:i/>
         </w:rPr>
-        <w:t>Neural network: a 2-8-4 multilayer perceptron,</w:t>
+        <w:t>Neural network: a 5-8-4 multilayer perceptron,</w:t>
       </w:r>
     </w:p>
     <w:p>
@@ -4559,7 +4622,7 @@
         <w:jc w:val="both"/>
       </w:pPr>
       <w:r>
-        <w:t xml:space="preserve">with 60 parameters; the largest </w:t>
+        <w:t xml:space="preserve">with 84 parameters; the largest </w:t>
       </w:r>
       <m:oMath>
         <m:sSub>
@@ -5602,7 +5665,7 @@
               <w:rPr>
                 <w:sz w:val="16"/>
               </w:rPr>
-              <w:t>Flicks (day 1 / 2)</w:t>
+              <w:t>Flicks</w:t>
             </w:r>
           </w:p>
         </w:tc>
@@ -6087,7 +6150,7 @@
               <w:rPr>
                 <w:sz w:val="16"/>
               </w:rPr>
-              <w:t>Loose support 3/4 turn</w:t>
+              <w:t>Support 3/4 turn</w:t>
             </w:r>
           </w:p>
         </w:tc>
@@ -6178,7 +6241,7 @@
               <w:rPr>
                 <w:sz w:val="16"/>
               </w:rPr>
-              <w:t>Loose support 1/4 turn</w:t>
+              <w:t>Support 1/4 turn</w:t>
             </w:r>
           </w:p>
         </w:tc>
@@ -6269,7 +6332,7 @@
               <w:rPr>
                 <w:sz w:val="16"/>
               </w:rPr>
-              <w:t>Loose support 1/2 turn</w:t>
+              <w:t>Support 1/2 turn</w:t>
             </w:r>
           </w:p>
         </w:tc>
@@ -6472,7 +6535,7 @@
               <w:rPr>
                 <w:sz w:val="16"/>
               </w:rPr>
-              <w:t>89 / 42 = 131</w:t>
+              <w:t>131</w:t>
             </w:r>
           </w:p>
         </w:tc>
@@ -7296,7 +7359,7 @@
         <w:jc w:val="both"/>
       </w:pPr>
       <w:r>
-        <w:t>Fig. 9 shows damping at each loosening step. At 1/4 and 1/2 turn the damping stays close to the healthy range, and only at 3/4 turn is it clearly higher. The screw clamp maintained a tight grip on the ruler until it was almost released, so the first two steps were near or below the detection threshold of this system. On these held-out flicks, the neural network labelled 7 of 13 (1/4 turn) and 0 of 12 (1/2 turn) as loose support, consistent with the features lying on the edge of the normal cluster. For this reason the firmware also offers key B, so an operator who sees a loose clamp can mark it directly.</w:t>
+        <w:t>Fig. 9 shows damping at each loosening step. At 1/4 and 1/2 turn the damping stays close to the healthy range, and only at 3/4 turn is it clearly higher. The screw clamp maintained a tight grip on the ruler until it was almost released, so the first two steps were near or below the detection threshold of this system. On these held-out flicks, the neural network labelled 5 of 13 (1/4 turn) and 2 of 12 (1/2 turn) as loose support, consistent with the features lying on the edge of the normal cluster. For this reason the firmware also offers key B, so an operator who sees a loose clamp can mark it directly.</w:t>
       </w:r>
     </w:p>
     <w:p>
@@ -7318,7 +7381,7 @@
         <w:jc w:val="both"/>
       </w:pPr>
       <w:r>
-        <w:t xml:space="preserve">Table IV and Fig. 10 give the cross-validated accuracy. All three ML models beat the frequency-only rule (78.0%), by 10 to 18 percentage points, and kNN is best at 96.0%. The decision tree uses </w:t>
+        <w:t xml:space="preserve">Table IV and Fig. 10 give the cross-validated accuracy. All three ML models beat the frequency-only rule (78.0%), by 8 to 11 percentage points, and the decision tree is best at 88.6%. The decision tree uses </w:t>
       </w:r>
       <m:oMath>
         <m:sSub>
@@ -7348,10 +7411,10 @@
         </m:sSub>
       </m:oMath>
       <w:r>
-        <w:t xml:space="preserve"> for 43% of its splits and damping for 57%, confirming that the gain comes from the damping feature. The confusion matrices in Fig. 11 </w:t>
-      </w:r>
-      <w:r>
-        <w:t>show that most remaining errors are between healthy and loose support, the hardest pair. All five healthy re-check flicks were classified as healthy with no CHANGED alarm. Using all five features (adding amplitude, energy ratio and decay time) was also tested: accuracy fell to 85.7% (kNN), 87.3% (neural network) and 88.6% (tree), and the health error rose to 10.1 points, because these extra features vary with the strength of the hand flick and between boards. The final model therefore uses only the two relative features.</w:t>
+        <w:t xml:space="preserve"> for 40% of its splits, damping for 55% and energy ratio for 5%, confirming that the gain comes mainly from the damping feature. The confusion matrices in Fig. 11 </w:t>
+      </w:r>
+      <w:r>
+        <w:t>show that most remaining errors are between healthy and loose support, the hardest pair. All five healthy re-check flicks were classified as healthy with no CHANGED alarm. Using only the two relative features f1 and damping was also tested and gave higher scores (kNN 96.0%, neural network 93.1%, health error 4.3 points), because amplitude and decay time vary with the strength of the hand flick and between boards. The five-feature model was kept so that the board can also report rattle and decay behaviour, and because it was the design chosen at the start of the project.</w:t>
       </w:r>
     </w:p>
     <w:p>
@@ -7507,6 +7570,7 @@
             </w:pPr>
             <w:r>
               <w:rPr>
+                <w:b w:val="0"/>
                 <w:sz w:val="16"/>
               </w:rPr>
               <w:t>78.0%</w:t>
@@ -7547,9 +7611,10 @@
             </w:pPr>
             <w:r>
               <w:rPr>
+                <w:b/>
                 <w:sz w:val="16"/>
               </w:rPr>
-              <w:t>87.9%</w:t>
+              <w:t>88.6%</w:t>
             </w:r>
           </w:p>
         </w:tc>
@@ -7610,9 +7675,10 @@
             </w:pPr>
             <w:r>
               <w:rPr>
+                <w:b w:val="0"/>
                 <w:sz w:val="16"/>
               </w:rPr>
-              <w:t>96.0%</w:t>
+              <w:t>85.7%</w:t>
             </w:r>
           </w:p>
         </w:tc>
@@ -7637,7 +7703,7 @@
               <w:rPr>
                 <w:sz w:val="16"/>
               </w:rPr>
-              <w:t>Neural network 2-8-4</w:t>
+              <w:t>Neural network 5-8-4</w:t>
             </w:r>
           </w:p>
         </w:tc>
@@ -7654,10 +7720,10 @@
             </w:pPr>
             <w:r>
               <w:rPr>
-                <w:b/>
+                <w:b w:val="0"/>
                 <w:sz w:val="16"/>
               </w:rPr>
-              <w:t>93.1%</w:t>
+              <w:t>87.3%</w:t>
             </w:r>
           </w:p>
         </w:tc>
@@ -7747,7 +7813,7 @@
         <w:jc w:val="both"/>
       </w:pPr>
       <w:r>
-        <w:t>The kNN health score had a mean absolute error of 4.3 points, against 29.1 points for linear regression on the same features (Fig. 12). With the added-mass damage level set to 0.15, a coin reads about 85% rather than being treated as damage, while the loose joint reads about 50% at level 1 and close to 0% at level 2, which is reported as UNSAFE. On the day-1 support-loosening steps, a line fitted to steps 0 to 2 predicted the beam would become unsafe at step 3.6; in the experiment it was unsafe at step 3, so the forecast was slightly late but in the right range (Fig. 12, right).</w:t>
+        <w:t>The kNN health score had a mean absolute error of 10.1 points, against 24.8 points for linear regression on the same features (Fig. 12). With the added-mass damage level set to 0.15, a coin reads about 85% rather than being treated as damage, while the loose joint reads about 50% at level 1 and close to 0% at level 2, which is reported as UNSAFE. On the day-1 support-loosening steps, a line fitted to steps 0 to 2 predicted the beam would become unsafe at step 3.6; in the experiment it was unsafe at step 3, so the forecast was slightly late but in the right range (Fig. 12, right).</w:t>
       </w:r>
     </w:p>
     <w:tbl>
@@ -7982,7 +8048,7 @@
         <w:jc w:val="both"/>
       </w:pPr>
       <w:r>
-        <w:t>Each contribution is backed by a measured result. The assemble-only bench allowed repeatable results: the day-1 healthy re-check after all faults read 4.68 Hz against the original 4.74 Hz, and all 5 healthy checks were found to be healthy. Using the interpolated FFT algorithm on the Cortex-M3 gave an average frequency error of 0.009 Hz, less than a tenth of the 0.098 Hz bin width and three times better than the peak bin alone (0.027 Hz), in 117 ms. Adding damping to frequency, both relative to an on-board baseline, improved 4-class accuracy from 78.0% (classical frequency method) to 96.0% (kNN) across two days and two boards. The kNN model predicted the severity of damage with an average error of 4.3 points. Exporting the models to C kept the same features and logic as Python, giving identical results, and everything fits in about 20 KB of flash memory. An honest upper limit was also found: a support loosening of less than about 3/4 turn could not be reliably told apart from a healthy state using this sensor and structure.</w:t>
+        <w:t>Each contribution is backed by a measured result. The assemble-only bench allowed repeatable results: the day-1 healthy re-check after all faults read 4.68 Hz against the original 4.74 Hz, and all 5 healthy checks were found to be healthy. Using the interpolated FFT algorithm on the Cortex-M3 gave an average frequency error of 0.009 Hz, less than a tenth of the 0.098 Hz bin width and three times better than the peak bin alone (0.027 Hz), in 117 ms. Adding damping and three more features to frequency, all relative to an on-board baseline, improved 4-class accuracy from 78.0% (classical frequency method) to 88.6% (decision tree) across two days and two boards. The kNN model predicted the severity of damage with an average error of 10.1 points. Exporting the models to C kept the same features and logic as Python, giving identical results, and everything fits in about 20 KB of flash memory. An honest upper limit was also found: a support loosening of less than about 3/4 turn could not be reliably told apart from a healthy state using this sensor and structure.</w:t>
       </w:r>
     </w:p>
     <w:p>
@@ -8027,7 +8093,7 @@
         <w:jc w:val="both"/>
       </w:pPr>
       <w:r>
-        <w:t>This paper demonstrates that a full damage detection system using vibration data, producing a fault name, health value and trend prediction from raw acceleration data, can be implemented on an entry-level ARM Cortex-M3 processor and a low-cost MEMS accelerometer. On 131 recordings over two days and two boards, the tool-free cantilever test rig gave an accuracy of 96.0% (kNN) in distinguishing between healthy, added mass, loose joint and loose support cases, compared to 78.0% using the classical frequency shift rule. The health value had an average error of 4.3 points. Calibrating on ten healthy flicks made the same model work on a board that read a different absolute frequency, and damping, which is not considered by the frequency rule, was the main source of information regarding loose supports. All models fit within approximately 20 KB of flash memory and behave identically to the PC version, and a live dashboard makes every result visible. In the future the system will be improved by implementing a mechanical exciter, temperature compensation, higher modes from a second sensor and more data to reduce the detection limit for early loose support.</w:t>
+        <w:t>This paper demonstrates that a full damage detection system using vibration data, producing a fault name, health value and trend prediction from raw acceleration data, can be implemented on an entry-level ARM Cortex-M3 processor and a low-cost MEMS accelerometer. On 131 recordings over two days and two boards, the tool-free cantilever test rig gave an accuracy of 88.6% (decision tree) in distinguishing between healthy, added mass, loose joint and loose support cases, compared to 78.0% using the classical frequency shift rule. The health value had an average error of 10.1 points. Calibrating on ten healthy flicks made the same model work on a board that read a different absolute frequency, and damping, which is not considered by the frequency rule, was the main source of information regarding loose supports. All models fit within approximately 20 KB of flash memory and behave identically to the PC version, and a live dashboard makes every result visible. In the future the system will be improved by implementing a mechanical exciter, temperature compensation, higher modes from a second sensor and more data to reduce the detection limit for early loose support.</w:t>
       </w:r>
     </w:p>
     <w:p>

</xml_diff>

<commit_message>
Report: tight author block
</commit_message>
<xml_diff>
--- a/docs/final_report/TinySHM_Report.docx
+++ b/docs/final_report/TinySHM_Report.docx
@@ -36,60 +36,60 @@
           </w:tcPr>
           <w:p>
             <w:pPr>
-              <w:spacing w:after="40"/>
+              <w:spacing w:after="0" w:before="0" w:line="240" w:lineRule="auto"/>
               <w:jc w:val="center"/>
             </w:pPr>
             <w:r>
               <w:rPr>
-                <w:sz w:val="22"/>
+                <w:sz w:val="24"/>
               </w:rPr>
               <w:t>Sagnik Basu</w:t>
             </w:r>
           </w:p>
           <w:p>
             <w:pPr>
-              <w:spacing w:after="0" w:before="0"/>
+              <w:spacing w:after="0" w:before="0" w:line="240" w:lineRule="auto"/>
               <w:jc w:val="center"/>
             </w:pPr>
             <w:r>
               <w:rPr>
-                <w:sz w:val="19"/>
+                <w:sz w:val="22"/>
               </w:rPr>
               <w:t>School of Computer Engineering</w:t>
             </w:r>
           </w:p>
           <w:p>
             <w:pPr>
-              <w:spacing w:after="0" w:before="0"/>
+              <w:spacing w:after="0" w:before="0" w:line="240" w:lineRule="auto"/>
               <w:jc w:val="center"/>
             </w:pPr>
             <w:r>
               <w:rPr>
-                <w:sz w:val="19"/>
+                <w:sz w:val="22"/>
               </w:rPr>
               <w:t>Manipal Institute of Technology</w:t>
             </w:r>
           </w:p>
           <w:p>
             <w:pPr>
-              <w:spacing w:after="0" w:before="0"/>
+              <w:spacing w:after="0" w:before="0" w:line="240" w:lineRule="auto"/>
               <w:jc w:val="center"/>
             </w:pPr>
             <w:r>
               <w:rPr>
-                <w:sz w:val="19"/>
+                <w:sz w:val="22"/>
               </w:rPr>
               <w:t>Manipal, India</w:t>
             </w:r>
           </w:p>
           <w:p>
             <w:pPr>
-              <w:spacing w:after="0" w:before="0"/>
+              <w:spacing w:after="0" w:before="0" w:line="240" w:lineRule="auto"/>
               <w:jc w:val="center"/>
             </w:pPr>
             <w:r>
               <w:rPr>
-                <w:sz w:val="17"/>
+                <w:sz w:val="18"/>
               </w:rPr>
               <w:t>sagnik1.mitmpl2024@learner.manipal.edu</w:t>
             </w:r>
@@ -101,60 +101,60 @@
           </w:tcPr>
           <w:p>
             <w:pPr>
-              <w:spacing w:after="40"/>
+              <w:spacing w:after="0" w:before="0" w:line="240" w:lineRule="auto"/>
               <w:jc w:val="center"/>
             </w:pPr>
             <w:r>
               <w:rPr>
-                <w:sz w:val="22"/>
+                <w:sz w:val="24"/>
               </w:rPr>
               <w:t>Pranav Gaddam</w:t>
             </w:r>
           </w:p>
           <w:p>
             <w:pPr>
-              <w:spacing w:after="0" w:before="0"/>
+              <w:spacing w:after="0" w:before="0" w:line="240" w:lineRule="auto"/>
               <w:jc w:val="center"/>
             </w:pPr>
             <w:r>
               <w:rPr>
-                <w:sz w:val="19"/>
+                <w:sz w:val="22"/>
               </w:rPr>
               <w:t>School of Computer Engineering</w:t>
             </w:r>
           </w:p>
           <w:p>
             <w:pPr>
-              <w:spacing w:after="0" w:before="0"/>
+              <w:spacing w:after="0" w:before="0" w:line="240" w:lineRule="auto"/>
               <w:jc w:val="center"/>
             </w:pPr>
             <w:r>
               <w:rPr>
-                <w:sz w:val="19"/>
+                <w:sz w:val="22"/>
               </w:rPr>
               <w:t>Manipal Institute of Technology</w:t>
             </w:r>
           </w:p>
           <w:p>
             <w:pPr>
-              <w:spacing w:after="0" w:before="0"/>
+              <w:spacing w:after="0" w:before="0" w:line="240" w:lineRule="auto"/>
               <w:jc w:val="center"/>
             </w:pPr>
             <w:r>
               <w:rPr>
-                <w:sz w:val="19"/>
+                <w:sz w:val="22"/>
               </w:rPr>
               <w:t>Manipal, India</w:t>
             </w:r>
           </w:p>
           <w:p>
             <w:pPr>
-              <w:spacing w:after="0" w:before="0"/>
+              <w:spacing w:after="0" w:before="0" w:line="240" w:lineRule="auto"/>
               <w:jc w:val="center"/>
             </w:pPr>
             <w:r>
               <w:rPr>
-                <w:sz w:val="17"/>
+                <w:sz w:val="18"/>
               </w:rPr>
               <w:t>pranav10.mitmpl2024@learner.manipal.edu</w:t>
             </w:r>
@@ -166,60 +166,60 @@
           </w:tcPr>
           <w:p>
             <w:pPr>
-              <w:spacing w:after="40"/>
+              <w:spacing w:after="0" w:before="0" w:line="240" w:lineRule="auto"/>
               <w:jc w:val="center"/>
             </w:pPr>
             <w:r>
               <w:rPr>
-                <w:sz w:val="22"/>
+                <w:sz w:val="24"/>
               </w:rPr>
               <w:t>Shobit Hegde</w:t>
             </w:r>
           </w:p>
           <w:p>
             <w:pPr>
-              <w:spacing w:after="0" w:before="0"/>
+              <w:spacing w:after="0" w:before="0" w:line="240" w:lineRule="auto"/>
               <w:jc w:val="center"/>
             </w:pPr>
             <w:r>
               <w:rPr>
-                <w:sz w:val="19"/>
+                <w:sz w:val="22"/>
               </w:rPr>
               <w:t>School of Computer Engineering</w:t>
             </w:r>
           </w:p>
           <w:p>
             <w:pPr>
-              <w:spacing w:after="0" w:before="0"/>
+              <w:spacing w:after="0" w:before="0" w:line="240" w:lineRule="auto"/>
               <w:jc w:val="center"/>
             </w:pPr>
             <w:r>
               <w:rPr>
-                <w:sz w:val="19"/>
+                <w:sz w:val="22"/>
               </w:rPr>
               <w:t>Manipal Institute of Technology</w:t>
             </w:r>
           </w:p>
           <w:p>
             <w:pPr>
-              <w:spacing w:after="0" w:before="0"/>
+              <w:spacing w:after="0" w:before="0" w:line="240" w:lineRule="auto"/>
               <w:jc w:val="center"/>
             </w:pPr>
             <w:r>
               <w:rPr>
-                <w:sz w:val="19"/>
+                <w:sz w:val="22"/>
               </w:rPr>
               <w:t>Manipal, India</w:t>
             </w:r>
           </w:p>
           <w:p>
             <w:pPr>
-              <w:spacing w:after="0" w:before="0"/>
+              <w:spacing w:after="0" w:before="0" w:line="240" w:lineRule="auto"/>
               <w:jc w:val="center"/>
             </w:pPr>
             <w:r>
               <w:rPr>
-                <w:sz w:val="17"/>
+                <w:sz w:val="18"/>
               </w:rPr>
               <w:t>shobit.mitmpl2024@learner.manipal.edu</w:t>
             </w:r>

</xml_diff>

<commit_message>
Report: fit in 7 pages
</commit_message>
<xml_diff>
--- a/docs/final_report/TinySHM_Report.docx
+++ b/docs/final_report/TinySHM_Report.docx
@@ -1578,7 +1578,7 @@
       <w:r>
         <w:drawing>
           <wp:inline distT="0" distB="0" distL="0" distR="0" wp14:anchorId="022CEC13" wp14:editId="10694F80">
-            <wp:extent cx="3108960" cy="1476940"/>
+            <wp:extent cx="2798064" cy="1329246"/>
             <wp:effectExtent l="0" t="0" r="0" b="0"/>
             <wp:docPr id="2" name="Picture 2"/>
             <wp:cNvGraphicFramePr>
@@ -1600,7 +1600,7 @@
                   <pic:spPr>
                     <a:xfrm>
                       <a:off x="0" y="0"/>
-                      <a:ext cx="3108960" cy="1476940"/>
+                      <a:ext cx="2798064" cy="1329246"/>
                     </a:xfrm>
                     <a:prstGeom prst="rect">
                       <a:avLst/>
@@ -1634,7 +1634,7 @@
       <w:r>
         <w:drawing>
           <wp:inline distT="0" distB="0" distL="0" distR="0" wp14:anchorId="597EA90E" wp14:editId="6B285560">
-            <wp:extent cx="3108960" cy="2043447"/>
+            <wp:extent cx="2798064" cy="1839102"/>
             <wp:effectExtent l="0" t="0" r="0" b="0"/>
             <wp:docPr id="4" name="Picture 4"/>
             <wp:cNvGraphicFramePr>
@@ -1656,7 +1656,7 @@
                   <pic:spPr>
                     <a:xfrm>
                       <a:off x="0" y="0"/>
-                      <a:ext cx="3108960" cy="2043447"/>
+                      <a:ext cx="2798064" cy="1839102"/>
                     </a:xfrm>
                     <a:prstGeom prst="rect">
                       <a:avLst/>
@@ -1802,7 +1802,7 @@
         </w:rPr>
         <w:drawing>
           <wp:inline distT="0" distB="0" distL="0" distR="0" wp14:anchorId="16DC7456" wp14:editId="2267D7A4">
-            <wp:extent cx="3108960" cy="1888948"/>
+            <wp:extent cx="2798064" cy="1700053"/>
             <wp:effectExtent l="0" t="0" r="0" b="0"/>
             <wp:docPr id="6" name="Picture 6"/>
             <wp:cNvGraphicFramePr>
@@ -1824,7 +1824,7 @@
                   <pic:spPr>
                     <a:xfrm>
                       <a:off x="0" y="0"/>
-                      <a:ext cx="3108960" cy="1888948"/>
+                      <a:ext cx="2798064" cy="1700053"/>
                     </a:xfrm>
                     <a:prstGeom prst="rect">
                       <a:avLst/>
@@ -1861,7 +1861,7 @@
         </w:rPr>
         <w:drawing>
           <wp:inline distT="0" distB="0" distL="0" distR="0" wp14:anchorId="04C8849A" wp14:editId="1B93A924">
-            <wp:extent cx="3108960" cy="2152356"/>
+            <wp:extent cx="2798064" cy="1937120"/>
             <wp:effectExtent l="0" t="0" r="0" b="0"/>
             <wp:docPr id="7" name="Picture 7"/>
             <wp:cNvGraphicFramePr>
@@ -1883,7 +1883,7 @@
                   <pic:spPr>
                     <a:xfrm>
                       <a:off x="0" y="0"/>
-                      <a:ext cx="3108960" cy="2152356"/>
+                      <a:ext cx="2798064" cy="1937120"/>
                     </a:xfrm>
                     <a:prstGeom prst="rect">
                       <a:avLst/>
@@ -5511,7 +5511,7 @@
         </w:rPr>
         <w:drawing>
           <wp:inline distT="0" distB="0" distL="0" distR="0" wp14:anchorId="0ACC8F77" wp14:editId="64A88359">
-            <wp:extent cx="2208276" cy="3154680"/>
+            <wp:extent cx="1987448" cy="2839212"/>
             <wp:effectExtent l="0" t="0" r="0" b="0"/>
             <wp:docPr id="8" name="Picture 8"/>
             <wp:cNvGraphicFramePr>
@@ -5533,7 +5533,7 @@
                   <pic:spPr>
                     <a:xfrm>
                       <a:off x="0" y="0"/>
-                      <a:ext cx="2208276" cy="3154680"/>
+                      <a:ext cx="1987448" cy="2839212"/>
                     </a:xfrm>
                     <a:prstGeom prst="rect">
                       <a:avLst/>
@@ -7094,7 +7094,7 @@
         </w:rPr>
         <w:drawing>
           <wp:inline distT="0" distB="0" distL="0" distR="0" wp14:anchorId="2FC3D33C" wp14:editId="068B7FD7">
-            <wp:extent cx="2955110" cy="1385208"/>
+            <wp:extent cx="2659599" cy="1246687"/>
             <wp:effectExtent l="0" t="0" r="0" b="0"/>
             <wp:docPr id="9" name="Picture 9"/>
             <wp:cNvGraphicFramePr>
@@ -7116,7 +7116,7 @@
                   <pic:spPr>
                     <a:xfrm>
                       <a:off x="0" y="0"/>
-                      <a:ext cx="2955110" cy="1385208"/>
+                      <a:ext cx="2659599" cy="1246687"/>
                     </a:xfrm>
                     <a:prstGeom prst="rect">
                       <a:avLst/>
@@ -7153,7 +7153,7 @@
         </w:rPr>
         <w:drawing>
           <wp:inline distT="0" distB="0" distL="0" distR="0" wp14:anchorId="30B402D2" wp14:editId="04DCF01C">
-            <wp:extent cx="2955111" cy="2031639"/>
+            <wp:extent cx="2659599" cy="1828475"/>
             <wp:effectExtent l="0" t="0" r="0" b="0"/>
             <wp:docPr id="10" name="Picture 10"/>
             <wp:cNvGraphicFramePr>
@@ -7175,7 +7175,7 @@
                   <pic:spPr>
                     <a:xfrm>
                       <a:off x="0" y="0"/>
-                      <a:ext cx="2955111" cy="2031639"/>
+                      <a:ext cx="2659599" cy="1828475"/>
                     </a:xfrm>
                     <a:prstGeom prst="rect">
                       <a:avLst/>
@@ -7212,7 +7212,7 @@
         </w:rPr>
         <w:drawing>
           <wp:inline distT="0" distB="0" distL="0" distR="0" wp14:anchorId="2AF41008" wp14:editId="7017BCAC">
-            <wp:extent cx="2955112" cy="1871571"/>
+            <wp:extent cx="2659600" cy="1684413"/>
             <wp:effectExtent l="0" t="0" r="0" b="0"/>
             <wp:docPr id="11" name="Picture 11"/>
             <wp:cNvGraphicFramePr>
@@ -7234,7 +7234,7 @@
                   <pic:spPr>
                     <a:xfrm>
                       <a:off x="0" y="0"/>
-                      <a:ext cx="2955112" cy="1871571"/>
+                      <a:ext cx="2659600" cy="1684413"/>
                     </a:xfrm>
                     <a:prstGeom prst="rect">
                       <a:avLst/>
@@ -7271,7 +7271,7 @@
         </w:rPr>
         <w:drawing>
           <wp:inline distT="0" distB="0" distL="0" distR="0" wp14:anchorId="59AE1469" wp14:editId="0651D8CA">
-            <wp:extent cx="2955110" cy="1385208"/>
+            <wp:extent cx="2659599" cy="1246687"/>
             <wp:effectExtent l="0" t="0" r="0" b="0"/>
             <wp:docPr id="12" name="Picture 12"/>
             <wp:cNvGraphicFramePr>
@@ -7293,7 +7293,7 @@
                   <pic:spPr>
                     <a:xfrm>
                       <a:off x="0" y="0"/>
-                      <a:ext cx="2955110" cy="1385208"/>
+                      <a:ext cx="2659599" cy="1246687"/>
                     </a:xfrm>
                     <a:prstGeom prst="rect">
                       <a:avLst/>
@@ -7747,7 +7747,7 @@
         </w:rPr>
         <w:drawing>
           <wp:inline distT="0" distB="0" distL="0" distR="0" wp14:anchorId="0CF66C4B" wp14:editId="64A5217B">
-            <wp:extent cx="2955111" cy="960411"/>
+            <wp:extent cx="2659599" cy="864369"/>
             <wp:effectExtent l="0" t="0" r="0" b="0"/>
             <wp:docPr id="13" name="Picture 13"/>
             <wp:cNvGraphicFramePr>
@@ -7769,7 +7769,7 @@
                   <pic:spPr>
                     <a:xfrm>
                       <a:off x="0" y="0"/>
-                      <a:ext cx="2955111" cy="960411"/>
+                      <a:ext cx="2659599" cy="864369"/>
                     </a:xfrm>
                     <a:prstGeom prst="rect">
                       <a:avLst/>
@@ -7846,7 +7846,7 @@
               </w:rPr>
               <w:drawing>
                 <wp:inline distT="0" distB="0" distL="0" distR="0" wp14:anchorId="2E025A47" wp14:editId="2B4E3388">
-                  <wp:extent cx="1208565" cy="1022632"/>
+                  <wp:extent cx="1087708" cy="920368"/>
                   <wp:effectExtent l="0" t="0" r="0" b="0"/>
                   <wp:docPr id="14" name="Picture 14"/>
                   <wp:cNvGraphicFramePr>
@@ -7868,7 +7868,7 @@
                         <pic:spPr>
                           <a:xfrm>
                             <a:off x="0" y="0"/>
-                            <a:ext cx="1208565" cy="1022632"/>
+                            <a:ext cx="1087708" cy="920368"/>
                           </a:xfrm>
                           <a:prstGeom prst="rect">
                             <a:avLst/>
@@ -7897,7 +7897,7 @@
               </w:rPr>
               <w:drawing>
                 <wp:inline distT="0" distB="0" distL="0" distR="0" wp14:anchorId="721BA4CC" wp14:editId="298E0F63">
-                  <wp:extent cx="1533948" cy="1022632"/>
+                  <wp:extent cx="1380553" cy="920368"/>
                   <wp:effectExtent l="0" t="0" r="0" b="0"/>
                   <wp:docPr id="15" name="Picture 15"/>
                   <wp:cNvGraphicFramePr>
@@ -7919,7 +7919,7 @@
                         <pic:spPr>
                           <a:xfrm>
                             <a:off x="0" y="0"/>
-                            <a:ext cx="1533948" cy="1022632"/>
+                            <a:ext cx="1380553" cy="920368"/>
                           </a:xfrm>
                           <a:prstGeom prst="rect">
                             <a:avLst/>
@@ -7986,7 +7986,7 @@
       <w:r>
         <w:drawing>
           <wp:inline xmlns:a="http://schemas.openxmlformats.org/drawingml/2006/main" xmlns:pic="http://schemas.openxmlformats.org/drawingml/2006/picture">
-            <wp:extent cx="3017520" cy="1526102"/>
+            <wp:extent cx="2468880" cy="1248628"/>
             <wp:docPr id="16" name="Picture 16"/>
             <wp:cNvGraphicFramePr>
               <a:graphicFrameLocks noChangeAspect="1"/>
@@ -8007,7 +8007,7 @@
                   <pic:spPr>
                     <a:xfrm>
                       <a:off x="0" y="0"/>
-                      <a:ext cx="3017520" cy="1526102"/>
+                      <a:ext cx="2468880" cy="1248628"/>
                     </a:xfrm>
                     <a:prstGeom prst="rect"/>
                   </pic:spPr>
@@ -8137,7 +8137,7 @@
         <w:tabs>
           <w:tab w:val="left" w:pos="432"/>
         </w:tabs>
-        <w:spacing w:after="0" w:line="240" w:lineRule="auto"/>
+        <w:spacing w:after="0" w:line="240" w:lineRule="auto" w:before="0"/>
         <w:ind w:left="432" w:hanging="432"/>
       </w:pPr>
       <w:r>
@@ -8179,7 +8179,7 @@
         <w:tabs>
           <w:tab w:val="left" w:pos="432"/>
         </w:tabs>
-        <w:spacing w:after="0" w:line="240" w:lineRule="auto"/>
+        <w:spacing w:after="0" w:line="240" w:lineRule="auto" w:before="0"/>
         <w:ind w:left="432" w:hanging="432"/>
       </w:pPr>
       <w:r>
@@ -8214,7 +8214,7 @@
         <w:tabs>
           <w:tab w:val="left" w:pos="432"/>
         </w:tabs>
-        <w:spacing w:after="0" w:line="240" w:lineRule="auto"/>
+        <w:spacing w:after="0" w:line="240" w:lineRule="auto" w:before="0"/>
         <w:ind w:left="432" w:hanging="432"/>
       </w:pPr>
       <w:r>
@@ -8249,7 +8249,7 @@
         <w:tabs>
           <w:tab w:val="left" w:pos="432"/>
         </w:tabs>
-        <w:spacing w:after="0" w:line="240" w:lineRule="auto"/>
+        <w:spacing w:after="0" w:line="240" w:lineRule="auto" w:before="0"/>
         <w:ind w:left="432" w:hanging="432"/>
       </w:pPr>
       <w:r>
@@ -8284,7 +8284,7 @@
         <w:tabs>
           <w:tab w:val="left" w:pos="432"/>
         </w:tabs>
-        <w:spacing w:after="0" w:line="240" w:lineRule="auto"/>
+        <w:spacing w:after="0" w:line="240" w:lineRule="auto" w:before="0"/>
         <w:ind w:left="432" w:hanging="432"/>
       </w:pPr>
       <w:r>
@@ -8319,7 +8319,7 @@
         <w:tabs>
           <w:tab w:val="left" w:pos="432"/>
         </w:tabs>
-        <w:spacing w:after="0" w:line="240" w:lineRule="auto"/>
+        <w:spacing w:after="0" w:line="240" w:lineRule="auto" w:before="0"/>
         <w:ind w:left="432" w:hanging="432"/>
       </w:pPr>
       <w:r>
@@ -8354,7 +8354,7 @@
         <w:tabs>
           <w:tab w:val="left" w:pos="432"/>
         </w:tabs>
-        <w:spacing w:after="0" w:line="240" w:lineRule="auto"/>
+        <w:spacing w:after="0" w:line="240" w:lineRule="auto" w:before="0"/>
         <w:ind w:left="432" w:hanging="432"/>
       </w:pPr>
       <w:r>
@@ -8389,7 +8389,7 @@
         <w:tabs>
           <w:tab w:val="left" w:pos="432"/>
         </w:tabs>
-        <w:spacing w:after="0" w:line="240" w:lineRule="auto"/>
+        <w:spacing w:after="0" w:line="240" w:lineRule="auto" w:before="0"/>
         <w:ind w:left="432" w:hanging="432"/>
       </w:pPr>
       <w:r>
@@ -8424,7 +8424,7 @@
         <w:tabs>
           <w:tab w:val="left" w:pos="432"/>
         </w:tabs>
-        <w:spacing w:after="0" w:line="240" w:lineRule="auto"/>
+        <w:spacing w:after="0" w:line="240" w:lineRule="auto" w:before="0"/>
         <w:ind w:left="432" w:hanging="432"/>
       </w:pPr>
       <w:r>
@@ -8459,7 +8459,7 @@
         <w:tabs>
           <w:tab w:val="left" w:pos="432"/>
         </w:tabs>
-        <w:spacing w:after="0" w:line="240" w:lineRule="auto"/>
+        <w:spacing w:after="0" w:line="240" w:lineRule="auto" w:before="0"/>
         <w:ind w:left="432" w:hanging="432"/>
       </w:pPr>
       <w:r>
@@ -8494,7 +8494,7 @@
         <w:tabs>
           <w:tab w:val="left" w:pos="432"/>
         </w:tabs>
-        <w:spacing w:after="0" w:line="240" w:lineRule="auto"/>
+        <w:spacing w:after="0" w:line="240" w:lineRule="auto" w:before="0"/>
         <w:ind w:left="432" w:hanging="432"/>
       </w:pPr>
       <w:r>
@@ -8529,7 +8529,7 @@
         <w:tabs>
           <w:tab w:val="left" w:pos="432"/>
         </w:tabs>
-        <w:spacing w:after="0" w:line="240" w:lineRule="auto"/>
+        <w:spacing w:after="0" w:line="240" w:lineRule="auto" w:before="0"/>
         <w:ind w:left="432" w:hanging="432"/>
       </w:pPr>
       <w:r>
@@ -8564,7 +8564,7 @@
         <w:tabs>
           <w:tab w:val="left" w:pos="432"/>
         </w:tabs>
-        <w:spacing w:after="0" w:line="240" w:lineRule="auto"/>
+        <w:spacing w:after="0" w:line="240" w:lineRule="auto" w:before="0"/>
         <w:ind w:left="432" w:hanging="432"/>
       </w:pPr>
       <w:r>
@@ -8599,7 +8599,7 @@
         <w:tabs>
           <w:tab w:val="left" w:pos="432"/>
         </w:tabs>
-        <w:spacing w:after="0" w:line="240" w:lineRule="auto"/>
+        <w:spacing w:after="0" w:line="240" w:lineRule="auto" w:before="0"/>
         <w:ind w:left="432" w:hanging="432"/>
       </w:pPr>
       <w:r>
@@ -8634,7 +8634,7 @@
         <w:tabs>
           <w:tab w:val="left" w:pos="432"/>
         </w:tabs>
-        <w:spacing w:after="0" w:line="240" w:lineRule="auto"/>
+        <w:spacing w:after="0" w:line="240" w:lineRule="auto" w:before="0"/>
         <w:ind w:left="432" w:hanging="432"/>
       </w:pPr>
       <w:r>

</xml_diff>